<commit_message>
Rebrand to generic 'Autonomous Data Engineering Factory'; polish demo mode
- Remove all references to the specific customer name from UI, agents,
  templates, docs, and the login page. Reword owner emails to
  dealer_sales_coe@enterprise.example.com, snowflake accounts to
  enterprise-prod, salts to enterprise_pii_salt, etc.
- Change the top-right status pill: green 'LIVE · Azure OpenAI' when the
  LLM is reachable, blue 'Demo mode · deterministic' when it isn't
  (previously amber 'offline stubs' which read as broken).
- Rename Render service from andersen-adef to adef-demo.
- Regenerate DEMO_GUIDE.docx from the updated source.

Demo-mode note: when the Azure OpenAI env vars are unset, every LLM-driven
agent falls back to its deterministic response and the pipeline still
completes end-to-end. This is the recommended deployment mode when the
Azure OpenAI key cannot be exposed to the hosting platform.
</commit_message>
<xml_diff>
--- a/DEMO_GUIDE.docx
+++ b/DEMO_GUIDE.docx
@@ -12,7 +12,7 @@
           <w:color w:val="1E40AF"/>
           <w:sz w:val="48"/>
         </w:rPr>
-        <w:t>Andersen Autonomous Data Engineering Factory</w:t>
+        <w:t>Autonomous Data Engineering Factory</w:t>
       </w:r>
     </w:p>
     <w:p>
@@ -70,7 +70,7 @@
           <w:i/>
           <w:color w:val="5C6A8C"/>
         </w:rPr>
-        <w:t>**Andersen Autonomous Data Engineering Factory** — an interactive prototype</w:t>
+        <w:t>**Autonomous Data Engineering Factory** — an interactive prototype</w:t>
       </w:r>
     </w:p>
     <w:p>
@@ -162,7 +162,7 @@
           <w:i/>
           <w:color w:val="5C6A8C"/>
         </w:rPr>
-        <w:t>*"Onboard the DealerSalesCRM source into the Andersen data platform. Create</w:t>
+        <w:t>*"Onboard the DealerSalesCRM source into the enterprise data platform. Create</w:t>
       </w:r>
     </w:p>
     <w:p>
@@ -290,7 +290,7 @@
         <w:t>reusable Cognizant agent pattern</w:t>
       </w:r>
       <w:r>
-        <w:t>. The Andersen</w:t>
+        <w:t>. The customer</w:t>
       </w:r>
     </w:p>
     <w:p>
@@ -485,7 +485,7 @@
               <w:rPr>
                 <w:sz w:val="21"/>
               </w:rPr>
-              <w:t>Reads the intake, verifies metadata sufficiency, decomposes the request into a task graph, picks the specialist agents, attaches Andersen policies (dbt style guide, retention, cost guardrails). Emits a reasoning trace + plan JSON.</w:t>
+              <w:t>Reads the intake, verifies metadata sufficiency, decomposes the request into a task graph, picks the specialist agents, attaches enterprise policies (dbt style guide, retention, cost guardrails). Emits a reasoning trace + plan JSON.</w:t>
             </w:r>
           </w:p>
         </w:tc>
@@ -711,7 +711,7 @@
               <w:rPr>
                 <w:sz w:val="21"/>
               </w:rPr>
-              <w:t xml:space="preserve"> macro following the Andersen dbt style guide. Asks the LLM to write business-friendly model descriptions for </w:t>
+              <w:t xml:space="preserve"> macro following the enterprise dbt style guide. Asks the LLM to write business-friendly model descriptions for </w:t>
             </w:r>
             <w:r>
               <w:rPr>
@@ -2006,7 +2006,7 @@
           <w:sz w:val="19"/>
           <w:shd w:val="clear" w:color="auto" w:fill="F1F3F7"/>
         </w:rPr>
-        <w:t>#    C:\Users\&lt;you&gt;\Andersen Automation Agents\</w:t>
+        <w:t>#    C:\Users\&lt;you&gt;\Autonomous-Data-Engineering-Factory\</w:t>
       </w:r>
     </w:p>
     <w:p>
@@ -6029,12 +6029,12 @@
     </w:p>
     <w:p>
       <w:r>
-        <w:t>we deploy in production. For Andersen we've assembled them into a working</w:t>
+        <w:t>we deploy in production. For this customer we've assembled them into a working</w:t>
       </w:r>
     </w:p>
     <w:p>
       <w:r>
-        <w:t>prototype configured to Andersen's platform stack (Snowflake, dbt, Fivetran,</w:t>
+        <w:t>prototype configured to the target platform stack (Snowflake, dbt, Fivetran,</w:t>
       </w:r>
     </w:p>
     <w:p>
@@ -6076,7 +6076,7 @@
           <w:sz w:val="19"/>
           <w:shd w:val="clear" w:color="auto" w:fill="EEF2F7"/>
         </w:rPr>
-        <w:t>andersen/data-platform-repo</w:t>
+        <w:t>&lt;customer-org&gt;/data-platform-repo</w:t>
       </w:r>
       <w:r>
         <w:t>,</w:t>

</xml_diff>